<commit_message>
feat(docx): retain footnotes, endnotes and reference links
</commit_message>
<xml_diff>
--- a/tests/fixtures/rich.docx
+++ b/tests/fixtures/rich.docx
@@ -1,3 +1,55 @@
+
+<file path=Content/Notes/endnotes.xml><?xml version="1.0" encoding="utf-8"?>
+<w:endnotes xmlns:w="http://schemas.openxmlformats.org/wordprocessingml/2006/main">
+  <w:endnote w:id="4">
+    <w:p>
+      <w:r>
+        <w:endnoteRef/>
+        <w:t> Endnote text.</w:t>
+      </w:r>
+    </w:p>
+  </w:endnote>
+</w:endnotes>
+</file>
+
+<file path=Content/Notes/footnotes.xml><?xml version="1.0" encoding="utf-8"?>
+<w:footnotes xmlns:w="http://schemas.openxmlformats.org/wordprocessingml/2006/main" xmlns:r="http://schemas.openxmlformats.org/officeDocument/2006/relationships" xmlns:a="http://schemas.openxmlformats.org/drawingml/2006/main" xmlns:wp="http://schemas.openxmlformats.org/drawingml/2006/wordprocessingDrawing">
+  <w:footnote w:id="-1" w:type="separator">
+    <w:p>
+      <w:r>
+        <w:t>Separator ignored</w:t>
+      </w:r>
+    </w:p>
+  </w:footnote>
+  <w:footnote w:id="9">
+    <w:p>
+      <w:r>
+        <w:footnoteRef/>
+        <w:t> Note text.</w:t>
+      </w:r>
+    </w:p>
+    <w:p>
+      <w:r>
+        <w:drawing>
+          <wp:inline>
+            <wp:extent cx="228600" cy="114300"/>
+            <a:graphic>
+              <a:blip r:embed="Picture"/>
+            </a:graphic>
+          </wp:inline>
+        </w:drawing>
+      </w:r>
+    </w:p>
+  </w:footnote>
+  <w:footnote w:id="7">
+    <w:p>
+      <w:r>
+        <w:t>Orphan ignored</w:t>
+      </w:r>
+    </w:p>
+  </w:footnote>
+</w:footnotes>
+</file>
 
 <file path=Content/main.xml><?xml version="1.0" encoding="utf-8"?>
 <w:document xmlns:w="http://schemas.openxmlformats.org/wordprocessingml/2006/main" xmlns:r="http://schemas.openxmlformats.org/officeDocument/2006/relationships" xmlns:a="http://schemas.openxmlformats.org/drawingml/2006/main" xmlns:wp="http://schemas.openxmlformats.org/drawingml/2006/wordprocessingDrawing" xmlns:mc="http://schemas.openxmlformats.org/markup-compatibility/2006">
@@ -139,6 +191,16 @@
         <w:t>Result</w:t>
       </w:r>
     </w:p>
+    <w:p>
+      <w:r>
+        <w:t>Foot</w:t>
+        <w:footnoteReference w:id="9"/>
+        <w:t> again</w:t>
+        <w:footnoteReference w:id="9"/>
+        <w:t> End</w:t>
+        <w:endnoteReference w:id="4"/>
+      </w:r>
+    </w:p>
   </w:body>
 </w:document>
 </file>

</xml_diff>

<commit_message>
feat(docx): retain multilevel lists and numbering state
</commit_message>
<xml_diff>
--- a/tests/fixtures/rich.docx
+++ b/tests/fixtures/rich.docx
@@ -201,8 +201,198 @@
         <w:endnoteReference w:id="4"/>
       </w:r>
     </w:p>
+    <w:p>
+      <w:pPr>
+        <w:numPr>
+          <w:ilvl w:val="0"/>
+          <w:numId w:val="1"/>
+        </w:numPr>
+      </w:pPr>
+      <w:r>
+        <w:t>List first</w:t>
+      </w:r>
+    </w:p>
+    <w:p>
+      <w:pPr>
+        <w:numPr>
+          <w:ilvl w:val="1"/>
+          <w:numId w:val="1"/>
+        </w:numPr>
+      </w:pPr>
+      <w:r>
+        <w:t>Nested</w:t>
+      </w:r>
+    </w:p>
+    <w:p>
+      <w:pPr>
+        <w:numPr>
+          <w:ilvl w:val="0"/>
+          <w:numId w:val="1"/>
+        </w:numPr>
+      </w:pPr>
+      <w:r>
+        <w:t>List second</w:t>
+      </w:r>
+    </w:p>
+    <w:p>
+      <w:r>
+        <w:t>Break</w:t>
+      </w:r>
+    </w:p>
+    <w:p>
+      <w:pPr>
+        <w:numPr>
+          <w:ilvl w:val="0"/>
+          <w:numId w:val="1"/>
+        </w:numPr>
+      </w:pPr>
+      <w:r>
+        <w:t>List resumed</w:t>
+      </w:r>
+    </w:p>
+    <w:p>
+      <w:pPr>
+        <w:numPr>
+          <w:ilvl w:val="0"/>
+          <w:numId w:val="2"/>
+        </w:numPr>
+      </w:pPr>
+      <w:r>
+        <w:t>Restart</w:t>
+      </w:r>
+    </w:p>
+    <w:p>
+      <w:pPr>
+        <w:numPr>
+          <w:ilvl w:val="0"/>
+          <w:numId w:val="3"/>
+        </w:numPr>
+      </w:pPr>
+      <w:r>
+        <w:t>Bullet</w:t>
+      </w:r>
+    </w:p>
+    <w:p>
+      <w:pPr>
+        <w:numPr>
+          <w:ilvl w:val="0"/>
+          <w:numId w:val="4"/>
+        </w:numPr>
+      </w:pPr>
+      <w:r>
+        <w:t>Roman</w:t>
+      </w:r>
+    </w:p>
+    <w:p>
+      <w:pPr>
+        <w:pStyle w:val="NumberStyle"/>
+      </w:pPr>
+      <w:r>
+        <w:t>Styled list</w:t>
+      </w:r>
+    </w:p>
+    <w:p>
+      <w:pPr>
+        <w:numPr>
+          <w:ilvl w:val="0"/>
+          <w:numId w:val="5"/>
+        </w:numPr>
+      </w:pPr>
+      <w:r>
+        <w:t>Never parent</w:t>
+      </w:r>
+    </w:p>
+    <w:p>
+      <w:pPr>
+        <w:numPr>
+          <w:ilvl w:val="1"/>
+          <w:numId w:val="5"/>
+        </w:numPr>
+      </w:pPr>
+      <w:r>
+        <w:t>Never first</w:t>
+      </w:r>
+    </w:p>
+    <w:p>
+      <w:pPr>
+        <w:numPr>
+          <w:ilvl w:val="0"/>
+          <w:numId w:val="5"/>
+        </w:numPr>
+      </w:pPr>
+      <w:r>
+        <w:t>Never parent two</w:t>
+      </w:r>
+    </w:p>
+    <w:p>
+      <w:pPr>
+        <w:numPr>
+          <w:ilvl w:val="1"/>
+          <w:numId w:val="5"/>
+        </w:numPr>
+      </w:pPr>
+      <w:r>
+        <w:t>Never second</w:t>
+      </w:r>
+    </w:p>
   </w:body>
 </w:document>
+</file>
+
+<file path=Styles/numbering.xml><?xml version="1.0" encoding="utf-8"?>
+<w:numbering xmlns:w="http://schemas.openxmlformats.org/wordprocessingml/2006/main">
+  <w:abstractNum w:abstractNumId="0">
+    <w:lvl w:ilvl="0">
+      <w:start w:val="3"/>
+      <w:numFmt w:val="decimal"/>
+      <w:lvlText w:val="%1."/>
+    </w:lvl>
+    <w:lvl w:ilvl="1">
+      <w:start w:val="1"/>
+      <w:numFmt w:val="lowerLetter"/>
+      <w:lvlText w:val="%1.%2)"/>
+    </w:lvl>
+  </w:abstractNum>
+  <w:abstractNum w:abstractNumId="1">
+    <w:lvl w:ilvl="0">
+      <w:numFmt w:val="bullet"/>
+      <w:lvlText w:val="•"/>
+    </w:lvl>
+  </w:abstractNum>
+  <w:abstractNum w:abstractNumId="2">
+    <w:lvl w:ilvl="0">
+      <w:start w:val="4"/>
+      <w:numFmt w:val="upperRoman"/>
+      <w:lvlText w:val="%1)"/>
+    </w:lvl>
+  </w:abstractNum>
+  <w:num w:numId="1">
+    <w:abstractNumId w:val="0"/>
+  </w:num>
+  <w:num w:numId="2">
+    <w:abstractNumId w:val="0"/>
+    <w:lvlOverride w:ilvl="0">
+      <w:startOverride w:val="10"/>
+    </w:lvlOverride>
+  </w:num>
+  <w:num w:numId="3">
+    <w:abstractNumId w:val="1"/>
+  </w:num>
+  <w:num w:numId="4">
+    <w:abstractNumId w:val="2"/>
+  </w:num>
+  <w:num w:numId="5">
+    <w:abstractNumId w:val="0"/>
+    <w:lvlOverride w:ilvl="1">
+      <w:lvl w:ilvl="1">
+        <w:start w:val="5"/>
+        <w:numFmt w:val="lowerLetter"/>
+        <w:lvlText w:val="%2)"/>
+        <w:lvlRestart w:val="0"/>
+      </w:lvl>
+    </w:lvlOverride>
+  </w:num>
+</w:numbering>
 </file>
 
 <file path=Styles/styles.xml><?xml version="1.0" encoding="utf-8"?>
@@ -240,5 +430,13 @@
       <w:i/>
     </w:rPr>
   </w:style>
+  <w:style w:type="paragraph" w:styleId="NumberStyle">
+    <w:basedOn w:val="Normal"/>
+    <w:pPr>
+      <w:numPr>
+        <w:numId w:val="1"/>
+      </w:numPr>
+    </w:pPr>
+  </w:style>
 </w:styles>
 </file>
</xml_diff>

<commit_message>
feat(layout): render shared underline and strike decorations
</commit_message>
<xml_diff>
--- a/tests/fixtures/rich.docx
+++ b/tests/fixtures/rich.docx
@@ -80,6 +80,25 @@
           <w:rStyle w:val="Child"/>
         </w:rPr>
         <w:t>Styled</w:t>
+      </w:r>
+      <w:r>
+        <w:t> </w:t>
+      </w:r>
+      <w:r>
+        <w:rPr>
+          <w:rStyle w:val="Child"/>
+          <w:u w:val="none"/>
+        </w:rPr>
+        <w:t>Clear</w:t>
+      </w:r>
+      <w:r>
+        <w:t> </w:t>
+      </w:r>
+      <w:r>
+        <w:rPr>
+          <w:strike/>
+        </w:rPr>
+        <w:t>Struck</w:t>
       </w:r>
     </w:p>
     <w:p>
@@ -422,6 +441,7 @@
     <w:rPr>
       <w:sz w:val="28"/>
       <w:color w:val="122334"/>
+      <w:u w:val="single"/>
     </w:rPr>
   </w:style>
   <w:style w:type="character" w:styleId="Child">

</xml_diff>